<commit_message>
refactor(standards): update VLA standard resume with summary and skills tweaks
- "robot foundation models" → "multimodal foundation models" in summary
- "reinforcement learning" → "reinforcement learning for manipulation" in summary
- Remove "Grasping," from Robotics skills (VLA resume only)

Co-Authored-By: Claude Sonnet 4.6 <noreply@anthropic.com>
</commit_message>
<xml_diff>
--- a/Alex_Nettekoven_Resume_Standard_VLA.docx
+++ b/Alex_Nettekoven_Resume_Standard_VLA.docx
@@ -177,7 +177,7 @@
           <w:szCs w:val="22"/>
           <w:rtl w:val="0"/>
         </w:rPr>
-        <w:t>Robotics researcher and engineer applying for [job title] at [company]. I specialize in robot learning, including VLAs and reinforcement learning, sim-to-real transfer, and full stack robot deployment. 5+ years building novel robotic systems and robot foundation models for real-world environments.</w:t>
+        <w:t>Robotics researcher and engineer applying for [job title] at [company]. I specialize in robot learning, including VLAs and reinforcement learning for manipulation, sim-to-real transfer, and full stack robot deployment. 5+ years building novel robotic systems and multimodal foundation models for real-world environments.</w:t>
       </w:r>
       <w:r>
         <w:rPr>
@@ -1472,7 +1472,7 @@
           <w:szCs w:val="22"/>
           <w:rtl w:val="0"/>
         </w:rPr>
-        <w:t>Robotics: Kinematics (forward, inverse), Bimanual Manipulation, Grasping, Computer Vision (SLAM, VIO, OpenCV), Tactile Sensing, Motion Planning (trajectory generation, trajectory optimization), Sim-to-Real Transfer</w:t>
+        <w:t>Robotics: Kinematics (forward, inverse), Bimanual Manipulation, Computer Vision (SLAM, VIO, OpenCV), Tactile Sensing, Motion Planning (trajectory generation, trajectory optimization), Sim-to-Real Transfer</w:t>
       </w:r>
     </w:p>
     <w:p>

</xml_diff>